<commit_message>
V0.2.4C.2 — integrar o fluxo “Novo item sem área” com a gestão de Áreas.
</commit_message>
<xml_diff>
--- a/rotina/doc/Backlog_Projeto_Rotina_v0.2.docx
+++ b/rotina/doc/Backlog_Projeto_Rotina_v0.2.docx
@@ -7900,6 +7900,31 @@
     <w:p>
       <w:r>
         <w:t>Criação: formulário gera UUID uma única vez para a tentativa; Server Action recebe id + nome e valida UUID; user_id nunca vem do browser. Repository insere id, user_id da sessão verificada e nome. Retry da mesma instância reutiliza UUID; UUID não autoriza acesso e RLS permanece obrigatória. Somente documentação: V0.2.4B não iniciada, sem migration/db push.</w:t>
+      </w:r>
+    </w:p>
+    <w:p>
+      <w:r>
+        <w:t>Fechamento V0.2.4C.1 — 20/10/2026</w:t>
+      </w:r>
+    </w:p>
+    <w:p>
+      <w:r>
+        <w:t>Status final: CONCLUÍDA — VALIDADA NO NAVEGADOR REAL, conforme confirmação da usuária. Gestão real de Áreas na rota /banco-mestre/areas. Registro detalhado: V0.2.4C.1-tela-areas.md.</w:t>
+      </w:r>
+    </w:p>
+    <w:p>
+      <w:r>
+        <w:t>Aprovados: criação real de área; renomeação real; persistência após refresh; conflito em duas abas; rascunho preservado no conflito; ausência de sobrescrita automática; desativação real; reativação real; sessão expirada retornando Unauthorized com Entrar novamente; rascunho preservado após sessão expirada; falha de rede sem falso sucesso; rascunho preservado na falha de rede; snapshot/updated_at validado através do PostgREST real.</w:t>
+      </w:r>
+    </w:p>
+    <w:p>
+      <w:r>
+        <w:t>Próxima subetapa liberada: V0.2.4C.2 — integrar o estado sem área do ActivityForm ao fluxo real de criação/reativação de Áreas. Status: não iniciada; implementação somente mediante nova instrução. O fechamento global da V0.2.4D não foi antecipado. Menções anteriores à gestão de Áreas ainda não implementada/validada são históricas.</w:t>
+      </w:r>
+    </w:p>
+    <w:p>
+      <w:r>
+        <w:t>Este fechamento altera somente documentação. Nenhuma alteração de código funcional, ActivityForm, schema/RLS/Auth, migration ou db push. Os resultados reais foram relatados pela usuária, sem novas operações remotas do agente. A melhoria visual residual de Unauthorized já registrada no backlog permanece não bloqueante.</w:t>
       </w:r>
     </w:p>
     <w:sectPr>

</xml_diff>

<commit_message>
formalizar o encerramento da C.2
</commit_message>
<xml_diff>
--- a/rotina/doc/Backlog_Projeto_Rotina_v0.2.docx
+++ b/rotina/doc/Backlog_Projeto_Rotina_v0.2.docx
@@ -7925,6 +7925,41 @@
     <w:p>
       <w:r>
         <w:t>Este fechamento altera somente documentação. Nenhuma alteração de código funcional, ActivityForm, schema/RLS/Auth, migration ou db push. Os resultados reais foram relatados pela usuária, sem novas operações remotas do agente. A melhoria visual residual de Unauthorized já registrada no backlog permanece não bloqueante.</w:t>
+      </w:r>
+    </w:p>
+    <w:p>
+      <w:r>
+        <w:t>Fechamento V0.2.4C.2 — 20/10/2026</w:t>
+      </w:r>
+    </w:p>
+    <w:p>
+      <w:r>
+        <w:t>Status final: CONCLUÍDA — VALIDADA NO NAVEGADOR REAL, conforme confirmação da usuária. Registro detalhado: V0.2.4C.2-primeira-area-activity-form.md.</w:t>
+      </w:r>
+    </w:p>
+    <w:p>
+      <w:r>
+        <w:t>Conta com todas as áreas inativas: estado aprovado; CTA Criar ou reativar área; ida para /banco-mestre/areas com returnTo; reativação; retorno Voltar para criar item; Novo item reaberto com áreas reais; nenhuma seleção automática.</w:t>
+      </w:r>
+    </w:p>
+    <w:p>
+      <w:r>
+        <w:t>Conta sem nenhuma área: estado aprovado; mensagem Crie sua primeira área; CTA Criar primeira área; criação da primeira área; retorno para Novo item; área criada disponível no formulário; criação do primeiro item possível sem preparação manual.</w:t>
+      </w:r>
+    </w:p>
+    <w:p>
+      <w:r>
+        <w:t>Objetivo central da V0.2.4 atendido: uma conta nova consegue usar o Banco Mestre do zero sem SQL manual, seed ou área técnica pré-criada.</w:t>
+      </w:r>
+    </w:p>
+    <w:p>
+      <w:r>
+        <w:t>Próxima etapa: V0.2.4D liberada para definição/fechamento global mediante nova instrução, mas não iniciada nem concluída. As pendências anteriores de C.2 são históricas e estão superadas por esta confirmação.</w:t>
+      </w:r>
+    </w:p>
+    <w:p>
+      <w:r>
+        <w:t>Somente documentação neste fechamento: nenhum código funcional, migration, db push ou alteração de schema/RLS/Auth. Resultados reais relatados pela usuária, sem novas operações remotas do agente. A melhoria visual residual de Unauthorized já registrada permanece não bloqueante.</w:t>
       </w:r>
     </w:p>
     <w:sectPr>

</xml_diff>

<commit_message>
V0.2.4 — Gestão real de Áreas do Banco Mestre
</commit_message>
<xml_diff>
--- a/rotina/doc/Backlog_Projeto_Rotina_v0.2.docx
+++ b/rotina/doc/Backlog_Projeto_Rotina_v0.2.docx
@@ -7960,6 +7960,96 @@
     <w:p>
       <w:r>
         <w:t>Somente documentação neste fechamento: nenhum código funcional, migration, db push ou alteração de schema/RLS/Auth. Resultados reais relatados pela usuária, sem novas operações remotas do agente. A melhoria visual residual de Unauthorized já registrada permanece não bloqueante.</w:t>
+      </w:r>
+    </w:p>
+    <w:p>
+      <w:r>
+        <w:t>V0.2.4D — auditoria e fechamento global — 20/10/2026</w:t>
+      </w:r>
+    </w:p>
+    <w:p>
+      <w:r>
+        <w:t>Status: V0.2.4 CONCLUÍDA no escopo final aprovado, sem divergência funcional bloqueante identificada. A, B.1, B.2, C.1 e C.2 entregues; D consolida a auditoria. Referência atual: V0.2.4D-auditoria-fechamento-areas.md. Menções anteriores a subetapas não iniciadas ou validação pendente são históricas.</w:t>
+      </w:r>
+    </w:p>
+    <w:p>
+      <w:r>
+        <w:t>Escopo confirmado no código/testes: listar áreas próprias; criar; renomear; ativar; desativar; sem DELETE ou reorder; ownership/RLS preservados; concorrência por snapshot completo; erros seguros; gestão acessível no Banco Mestre; conta sem áreas; conta com todas inativas; retorno seguro para Novo item; primeiro item sem preparação manual.</w:t>
+      </w:r>
+    </w:p>
+    <w:p>
+      <w:r>
+        <w:t>C.1 e C.2 validadas no navegador real pela usuária: criação/renomeação/ativação/desativação, persistência, snapshot/updated_at via PostgREST, conflito sem sobrescrita e com rascunho preservado, sessão expirada com Unauthorized, falha de rede sem falso sucesso e os dois fluxos de primeiro uso. Esta auditoria não executou novo smoke remoto.</w:t>
+      </w:r>
+    </w:p>
+    <w:p>
+      <w:r>
+        <w:t>Objetivo central atendido: conta nova usa o Banco Mestre do zero sem SQL manual, seed ou área técnica pré-criada. Retorno somente para /banco-mestre/nova, sem redirect arbitrário nem seleção automática.</w:t>
+      </w:r>
+    </w:p>
+    <w:p>
+      <w:r>
+        <w:t>Limites: sort_position permanece interno para leitura/snapshot; reorder/drag-and-drop/mover para cima-baixo exige contrato futuro. Grants/RLS/schema preservados, sem nova migration. A proposta intermediária de prioridade numérica foi retirada por decisão explícita e não é pendência do marco fechado.</w:t>
+      </w:r>
+    </w:p>
+    <w:p>
+      <w:r>
+        <w:t>Pendências não bloqueantes mantidas: aviso visual Unauthorized após recuperar sessão pode exigir reload/F5; recomendação preexistente cacheComponents/partialPrefetching. Não implementadas nesta auditoria.</w:t>
+      </w:r>
+    </w:p>
+    <w:p>
+      <w:r>
+        <w:t>Auditoria somente documental: nenhum código funcional, teste, configuração, migration, RPC ou db push alterado/executado; nenhuma escrita remota. Verificações locais e matriz de evidências registradas no relatório D. Nenhum próximo marco foi definido ou iniciado; aguardar nova instrução.</w:t>
+      </w:r>
+    </w:p>
+    <w:p>
+      <w:r>
+        <w:t>Fechamento formal V0.2.4 — Gestão de Áreas — 20/10/2026</w:t>
+      </w:r>
+    </w:p>
+    <w:p>
+      <w:r>
+        <w:t>Decisão: V0.2.4 CONCLUÍDA. Documento formal: V0.2.4D-fechamento-gestao-areas.md. Auditoria e matriz detalhada preservadas em V0.2.4D-auditoria-fechamento-areas.md.</w:t>
+      </w:r>
+    </w:p>
+    <w:p>
+      <w:r>
+        <w:t>Objetivo aprovado atendido: conta nova consegue usar o Banco Mestre do zero e criar primeira área/primeiro item sem SQL manual, seed ou área técnica pré-criada. Escopo entregue: listar próprias, criar, renomear, ativar/desativar, gestão acessível e primeiro uso/retorno ao Novo item sem seleção automática.</w:t>
+      </w:r>
+    </w:p>
+    <w:p>
+      <w:r>
+        <w:t>Arquitetura final: leitura SSR e ações autenticadas com getClaims/sub, repository de operações diretas em areas sob RLS, DTO/validação runtime/mapper com updated_at original. UI relê dados reais após sucesso. Schema/grants/RLS/Auth preservados; sem nova RPC ou migration.</w:t>
+      </w:r>
+    </w:p>
+    <w:p>
+      <w:r>
+        <w:t>Segurança/concorrência: user_id vem da sessão; UUID técnico não autoriza acesso. UPDATE condicionado por id, owner e snapshot completo; Conflict/NotFound seguros, sem sobrescrita automática ou retry com versão nova. Erros preservam rascunho; retorno permitido somente para /banco-mestre/nova.</w:t>
+      </w:r>
+    </w:p>
+    <w:p>
+      <w:r>
+        <w:t>Última rodada final da auditoria: 105 testes unitários, 61 SQL/PGlite, lint, TypeScript, build e diff-check aprovados. SQL sequencial para memória e rede no build para fonte Geist preexistente, sem alterar arquitetura. Não houve repetição de suítes para produzir esta consolidação documental.</w:t>
+      </w:r>
+    </w:p>
+    <w:p>
+      <w:r>
+        <w:t>Validações reais de C.1/C.2 confirmadas pela usuária: gestão completa, refresh, snapshot/updated_at no PostgREST, conflito em duas abas, sessão expirada e rede com rascunhos preservados/sem falso sucesso; primeiro uso com áreas inativas ou conta vazia e primeiro item sem preparação manual. Não repetidas manualmente nesta consolidação.</w:t>
+      </w:r>
+    </w:p>
+    <w:p>
+      <w:r>
+        <w:t>Fora do escopo fechado: DELETE; reorder/drag-and-drop/mover para cima-baixo; fusão; hierarquia; cores/ícones; áreas compartilhadas. Não são pendências bloqueantes. Evoluções exigem novo contrato.</w:t>
+      </w:r>
+    </w:p>
+    <w:p>
+      <w:r>
+        <w:t>Melhorias não bloqueantes mantidas no backlog: aviso visual Unauthorized após recuperar sessão pode persistir até reload/F5; avaliar cacheComponents/partialPrefetching. Nenhuma foi implementada neste fechamento.</w:t>
+      </w:r>
+    </w:p>
+    <w:p>
+      <w:r>
+        <w:t>Próximo marco liberado somente para definição: V0.2.5. Sem objetivo funcional presumido, sem implementação e sem início desta etapa. Somente documentação alterada; nenhum código funcional, migration, db push ou escrita remota.</w:t>
       </w:r>
     </w:p>
     <w:sectPr>

</xml_diff>

<commit_message>
V0.2.5A — definição de escopo e dependências
</commit_message>
<xml_diff>
--- a/rotina/doc/Backlog_Projeto_Rotina_v0.2.docx
+++ b/rotina/doc/Backlog_Projeto_Rotina_v0.2.docx
@@ -8050,6 +8050,101 @@
     <w:p>
       <w:r>
         <w:t>Próximo marco liberado somente para definição: V0.2.5. Sem objetivo funcional presumido, sem implementação e sem início desta etapa. Somente documentação alterada; nenhum código funcional, migration, db push ou escrita remota.</w:t>
+      </w:r>
+    </w:p>
+    <w:p>
+      <w:r>
+        <w:t>V0.2.5 — somente definição — 21/10/2026</w:t>
+      </w:r>
+    </w:p>
+    <w:p>
+      <w:r>
+        <w:t>Fonte da comparação: V0.2.5-definicao-proximo-marco.md. V0.2.3/V0.2.4 permanecem concluídas. Foram revisados README, Documento Mestre/Backlog, modelo V0.2.3A, fechamentos, telas Hoje/Planejamento/Calendário, tipos e tabelas de cadastro.</w:t>
+      </w:r>
+    </w:p>
+    <w:p>
+      <w:r>
+        <w:t>Estado encontrado: Hoje usa valores fictícios; Planejamento/Calendário são placeholders. As nove tabelas existentes guardam cadastro/configuração, não execução. goals não guarda progresso, planning_contexts não é plano diário, recurrence_rules não são ocorrências. Sem logs, occurrences ou preferências temporais persistidas.</w:t>
+      </w:r>
+    </w:p>
+    <w:p>
+      <w:r>
+        <w:t>Candidato Calendário/Occurrences: útil para agenda, mas exige semântica de geração, fuso, exceções, identidade, histórico e conclusão. Candidato Planejamento: útil para escolhas/alocações, mas exige plano e representação datada, sem confundir contexto com agendamento. Candidato Metas/progresso: entrega uso diário e pode funcionar sem Occurrence, mas exige logs, temporalidade, idempotência e retenção. Alternativa adicional: agenda derivada somente de leitura, menor escrita, sem ciclo de execução.</w:t>
+      </w:r>
+    </w:p>
+    <w:p>
+      <w:r>
+        <w:t>Recomendação após comparação, ainda a confirmar pela usuária: V0.2.5 — Metas e progresso diário, primeiro corte de contagens diárias manuais na tela Hoje para atividades/metas elegíveis. Não pressupõe todas as métricas, períodos, recorrência após conclusão, calendário ou planejador. Sem progresso fictício, reset de cadastro ou seed.</w:t>
+      </w:r>
+    </w:p>
+    <w:p>
+      <w:r>
+        <w:t>Antes de implementar: definir fuso/data civil e preferência temporal, histórico de Goal/Activity e impacto da remoção de filhas pela RPC atual, medição versus conclusão, correção/anulação, idempotência e leitura agregada sem N+1. Não criar FK/migration que quebre o editor ou apague histórico. Uma futura persistência de logs exigirá justificativa/modelagem própria; nenhuma migration está autorizada por esta definição.</w:t>
+      </w:r>
+    </w:p>
+    <w:p>
+      <w:r>
+        <w:t>Próximo passo: revisar/confirmar a recomendação e fechar o contrato temporal e de histórico. V0.2.5 está somente em definição; dados/servidor/UI/validação real ficam para entregas posteriores explicitamente autorizadas. Nenhum novo marco adicional ou versão futura foi presumido.</w:t>
+      </w:r>
+    </w:p>
+    <w:p>
+      <w:r>
+        <w:t>Somente documentação alterada: nenhum código funcional, UI, tipo, RPC, migration, db push ou acesso ao banco remoto. Testes anteriores de V0.2.4 permanecem históricos; esta definição não representa funcionalidade nova validada. Resíduos de Unauthorized/cacheComponents continuam não bloqueantes.</w:t>
+      </w:r>
+    </w:p>
+    <w:p>
+      <w:r>
+        <w:t>V0.2.5A — proposta formal de escopo — 21/10/2026</w:t>
+      </w:r>
+    </w:p>
+    <w:p>
+      <w:r>
+        <w:t>Fonte de planejamento: doc/V0.2.5A-definicao-escopo.md, apoiada pela comparação doc/V0.2.5-definicao-proximo-marco.md. Status: proposta aguardando aprovação de escopo; V0.2.4 permanece concluída e nenhuma parte de V0.2.5B foi iniciada.</w:t>
+      </w:r>
+    </w:p>
+    <w:p>
+      <w:r>
+        <w:t>Recomendação: Metas e progresso diário, primeiro corte de contagens count/day reais em Hoje para atividades ativas com metas habilitadas e válidas. Incluir marcação manual +1, realizado/mínimo/ideal, refresh, correção rastreável, idempotência e estados seguros. Não duplicar uma medição por quantidade de metas.</w:t>
+      </w:r>
+    </w:p>
+    <w:p>
+      <w:r>
+        <w:t>Dependência principal: contrato temporal e histórico. Definir data civil/fuso, retry versus novo comando e correção; preservar significado histórico quando metas/tipo mudarem. A RPC atual remove filhas ausentes: rever essa interação antes de adicionar logs/FKs, evitando perda histórica ou quebra da edição.</w:t>
+      </w:r>
+    </w:p>
+    <w:p>
+      <w:r>
+        <w:t>Alternativas adiadas: Calendário/Occurrences completos exigem identidade, exceções e geração; Planejamento exige contrato de plano/alocação. Agenda derivada de leitura é alternativa válida sem Occurrence persistida, mas não registra o realizado. Progresso não exige Occurrence e não substitui o futuro contrato de agenda.</w:t>
+      </w:r>
+    </w:p>
+    <w:p>
+      <w:r>
+        <w:t>Fora do corte: duration/quantity, week/month, histórico completo/lançamento retroativo, Occurrences, motor de recorrência, Planejamento, Calendário funcional, IA e integrações. Incremento não equivale automaticamente a conclusão. Nenhuma funcionalidade nova de Áreas.</w:t>
+      </w:r>
+    </w:p>
+    <w:p>
+      <w:r>
+        <w:t>Plano proposto: A aprovação de escopo; B.1 contrato temporal/histórico/persistência, primeira etapa técnica após aprovação; B.2 camada de dados e schema somente após contrato revisado e autorização; C servidor/agregação; D integração de Hoje; E validação real e fechamento. As subetapas não são autorização automática.</w:t>
+      </w:r>
+    </w:p>
+    <w:p>
+      <w:r>
+        <w:t>Persistência futura necessária: entidade de medições activity_progress_logs, autoridade/preferência de fuso e política de contexto histórico a desenhar em B.1. Nove tabelas atuais não armazenam progresso. Ownership/RLS/grants e integridade da mesma conta obrigatórios; sem cascata destrutiva. RPC versus comandos diretos ainda depende da atomicidade. Nenhuma migration foi criada.</w:t>
+      </w:r>
+    </w:p>
+    <w:p>
+      <w:r>
+        <w:t>Critérios de conclusão futura: persistência após refresh, retry idempotente e comandos distintos, correção auditável, virada de dia/fuso, edição histórica segura, leitura agregada sem N+1, isolamento A/B/anon, sessão/rede sem falso sucesso, suites automatizadas e navegador real. Resultados anteriores da V0.2.4 não validam V0.2.5.</w:t>
+      </w:r>
+    </w:p>
+    <w:p>
+      <w:r>
+        <w:t>Impactos: seção real delimitada em Hoje, sem apresentar cards fictícios como progresso real; possível ajuste mínimo futuro no cadastro/RPC para retenção histórica. Planejamento e Calendário não implementados. Reavaliar marcos posteriores após este ciclo, sem fixar versões automaticamente.</w:t>
+      </w:r>
+    </w:p>
+    <w:p>
+      <w:r>
+        <w:t>Entrega atual exclusivamente documental: proposta formal, README/status, Documento Mestre e Backlog. Sem código funcional, UI, RPC, migration ou db push. Decisões abertas e riscos detalhados no documento canônico.</w:t>
       </w:r>
     </w:p>
     <w:sectPr>

</xml_diff>

<commit_message>
V0.2.5B.1 — contrato temporal, histórico e persistência
</commit_message>
<xml_diff>
--- a/rotina/doc/Backlog_Projeto_Rotina_v0.2.docx
+++ b/rotina/doc/Backlog_Projeto_Rotina_v0.2.docx
@@ -8145,6 +8145,51 @@
     <w:p>
       <w:r>
         <w:t>Entrega atual exclusivamente documental: proposta formal, README/status, Documento Mestre e Backlog. Sem código funcional, UI, RPC, migration ou db push. Decisões abertas e riscos detalhados no documento canônico.</w:t>
+      </w:r>
+    </w:p>
+    <w:p>
+      <w:r>
+        <w:t>V0.2.5B.1 — fechamento do contrato conceitual de progresso — 21/10/2026</w:t>
+      </w:r>
+    </w:p>
+    <w:p>
+      <w:r>
+        <w:t>Fonte canônica: doc/V0.2.5B.1-contrato-progresso.md, consolidando os contratos temporal e histórico. B.1 concluída somente como documentação; B.2 não iniciada. Atualiza status anteriores de B.1 pendente.</w:t>
+      </w:r>
+    </w:p>
+    <w:p>
+      <w:r>
+        <w:t>Decisões: UUID estável por intenção, unicidade por conta, retry com mesmo conteúdo retorna evento original, duas intenções/abas distintas podem gerar duas execuções. Commit com resposta perdida não duplica ao repetir a mesma tentativa. Dia/fuso da aceitação preservados; contexto vencido e revision antiga rejeitam tentativa nova.</w:t>
+      </w:r>
+    </w:p>
+    <w:p>
+      <w:r>
+        <w:t>Modelo recomendado: activity_progress_logs imutável (owner/Activity, tentativa, data civil, fuso/revisão, instante, count/1/execution e snapshot nome/tipo/revision), preferência temporal confirmada, tentativas/receipts, versões históricas de metas, associações e fatos de anulação. Constraints compostas de ownership e unicidade; sem FK obrigatória à Goal viva nem cascata destrutiva.</w:t>
+      </w:r>
+    </w:p>
+    <w:p>
+      <w:r>
+        <w:t>Comandos de registro/anulação por RPC transacional de privilégio restrito, sessão normal e RLS. Sem DML histórico direto do cliente; anon sem acesso. Anulação idempotente conserva original e corrige seu dia, sem DELETE ou valor negativo avulso.</w:t>
+      </w:r>
+    </w:p>
+    <w:p>
+      <w:r>
+        <w:t>Impacto futuro obrigatório: adaptar save_activity_aggregate preservando assinatura/SECURITY INVOKER/PT409/atomicidade, com captura de versões e tombstones e proteção de DML direto. Não alterar migrations antigas. Editor mantém expectedRevision e não envia snapshots; mudanças de alvo não geram crédito retroativo.</w:t>
+      </w:r>
+    </w:p>
+    <w:p>
+      <w:r>
+        <w:t>Migration futura condicionada à aprovação: fundação incremental de progresso/histórico, policies/grants, captura inicial e integração segura com save, comandos e contexto temporal. Não preencher fuso silenciosamente. Rever DDL, papel restrito, captura/revision, locks, backfill/rollout e eliminação de conta antes de criar migration.</w:t>
+      </w:r>
+    </w:p>
+    <w:p>
+      <w:r>
+        <w:t>Testes funcionais futuros: concorrência/replay, duas intenções, resposta perdida, rollback, virada do dia, versões e DML direto, anulação dupla, A/B/anon e grants. Nenhuma validação funcional de progresso foi executada ou declarada nesta entrega documental.</w:t>
+      </w:r>
+    </w:p>
+    <w:p>
+      <w:r>
+        <w:t>Próximo passo possível após autorização: B.2 revisar desenho SQL/segurança e compatibilidade da captura histórica com save antes de produzir migration. Nenhum código, schema, migration, RPC ou db push nesta etapa.</w:t>
       </w:r>
     </w:p>
     <w:sectPr>

</xml_diff>

<commit_message>
inclusão de modulo finanças e verificação curta do codigo atual
</commit_message>
<xml_diff>
--- a/rotina/doc/Backlog_Projeto_Rotina_v0.2.docx
+++ b/rotina/doc/Backlog_Projeto_Rotina_v0.2.docx
@@ -8190,6 +8190,56 @@
     <w:p>
       <w:r>
         <w:t>Próximo passo possível após autorização: B.2 revisar desenho SQL/segurança e compatibilidade da captura histórica com save antes de produzir migration. Nenhum código, schema, migration, RPC ou db push nesta etapa.</w:t>
+      </w:r>
+    </w:p>
+    <w:p>
+      <w:r>
+        <w:t>Prioridade oficial — MVP utilizável — 22/10/2026</w:t>
+      </w:r>
+    </w:p>
+    <w:p>
+      <w:r>
+        <w:t>Prioridade atual: MVP utilizável. A trilha avançada de progresso V0.2.5 está pausada e preservada para retomada futura.</w:t>
+      </w:r>
+    </w:p>
+    <w:p>
+      <w:r>
+        <w:t>Preservar documentos, candidates e testes da trilha avançada; não continuar preflight/promoção. Banco Mestre e gestão de Áreas reais permanecem entregues. Esta prioridade substitui as recomendações anteriores de continuidade técnica.</w:t>
+      </w:r>
+    </w:p>
+    <w:p>
+      <w:r>
+        <w:t>MVP oficial: Hoje, Planejamento, Calendário, Projetos, Banco Mestre, Ideias e Finanças. Entregar botões/navegação/formulários reais, persistência, cálculos necessários e estados mínimos de loading/vazio/erro, sem dados fictícios apresentados como reais.</w:t>
+      </w:r>
+    </w:p>
+    <w:p>
+      <w:r>
+        <w:t>Finanças: /financas adicionada à Sidebar desktop (Wallet/lucide-react), menu Mais mobile e TopBar, sob proteção de sessão. Neste momento somente Página em construção; nenhuma operação financeira implementada.</w:t>
+      </w:r>
+    </w:p>
+    <w:p>
+      <w:r>
+        <w:t>Finanças futura: cadastrar receitas/ganhos e despesas/gastos com data, valor, descrição e categoria; visão mensal, totais de ganhos/gastos e saldo, identificação dos gastos, agrupamento por categoria e histórico mensal. Adiados: integração bancária/Open Finance, importação automática, cartão/fatura sofisticada, investimentos, previsões e IA financeira.</w:t>
+      </w:r>
+    </w:p>
+    <w:p>
+      <w:r>
+        <w:t>Mapa real e reuso detalhados no README.md: Hoje tem demonstrações e botões sem ação; Planejamento, Calendário, Projetos e Ideias são placeholders; Banco Mestre tem dados/ações reais; Finanças acaba de ganhar rota placeholder. Busca/configurações globais e criação global de Projeto/Ideia permanecem desabilitadas.</w:t>
+      </w:r>
+    </w:p>
+    <w:p>
+      <w:r>
+        <w:t>Sequência recomendada: 1) Planejamento + Hoje em entrega vertical, Banco Mestre -&gt; escolher Activity -&gt; Hoje/Amanhã/data -&gt; concluir -&gt; pendências/reagendar, com daily_plan_items simples proposta; 2) Calendário simples reutilizando esses dados; 3) Ideias persistidas; 4) Projetos e tarefas com percentual calculado; 5) Finanças manual mensal. Ideias tem corte menor que Projetos; Finanças independe dos demais e pode ser antecipada por prioridade de uso.</w:t>
+      </w:r>
+    </w:p>
+    <w:p>
+      <w:r>
+        <w:t>Próxima tela recomendada: Planejamento, junto ao mínimo funcional de Hoje. Sem Occurrence, motor de recorrência, IA/sugestões, progresso complexo, calendário completo, notificações, metas week/month ou histórico sofisticado no primeiro fluxo. Evitar engines genéricas, event sourcing e abstrações antecipadas.</w:t>
+      </w:r>
+    </w:p>
+    <w:p>
+      <w:r>
+        <w:t>Nesta tarefa nenhuma migration/db push, alteração do Banco Mestre ou continuação da arquitetura de progresso. Infraestrutura futura somente quando necessária à funcionalidade visível. Resíduos de Unauthorized visual após recuperar sessão e cacheComponents/partialPrefetching continuam não bloqueantes.</w:t>
       </w:r>
     </w:p>
     <w:sectPr>

</xml_diff>

<commit_message>
Inicio da implementação do MVP funcional
</commit_message>
<xml_diff>
--- a/rotina/doc/Backlog_Projeto_Rotina_v0.2.docx
+++ b/rotina/doc/Backlog_Projeto_Rotina_v0.2.docx
@@ -8240,6 +8240,51 @@
     <w:p>
       <w:r>
         <w:t>Nesta tarefa nenhuma migration/db push, alteração do Banco Mestre ou continuação da arquitetura de progresso. Infraestrutura futura somente quando necessária à funcionalidade visível. Resíduos de Unauthorized visual após recuperar sessão e cacheComponents/partialPrefetching continuam não bloqueantes.</w:t>
+      </w:r>
+    </w:p>
+    <w:p>
+      <w:r>
+        <w:t>MVP utilizável — primeira entrega Planejamento + Hoje — 22/10/2026</w:t>
+      </w:r>
+    </w:p>
+    <w:p>
+      <w:r>
+        <w:t>Implementação local pronta para validação automatizada e futura validação no navegador real; não declarar aprovação remota. Banco Mestre permite Planejar Activities ativas; Planejamento lista por data e permite Hoje/Amanhã/data, concluir/desfazer e reagendar; Hoje mostra dados reais, concluídos da data planejada e pendências, sem demonstrações.</w:t>
+      </w:r>
+    </w:p>
+    <w:p>
+      <w:r>
+        <w:t>Persistência: migration incremental 20261022000100_daily_plan_items.sql, com UUID, owner, Activity, planned_date, completed_at e timestamps. FK composta, unicidade Activity/data/owner, índice owner/data e RLS. Sem DELETE/RPC complexa. Inserção exige Activity ativa no banco; planos antigos continuam legíveis e concluíveis após desativação.</w:t>
+      </w:r>
+    </w:p>
+    <w:p>
+      <w:r>
+        <w:t>Concorrência: UPDATE com id, owner e snapshot completo (data/conclusão/updated_at original com microssegundos), sem retry automático ou sobrescrita. Sessão normal verificada nas actions; GET protegido. Sucesso somente após confirmação; falha incerta mantém escolhas e UUID da tentativa e orienta verificar dados salvos.</w:t>
+      </w:r>
+    </w:p>
+    <w:p>
+      <w:r>
+        <w:t>Dia civil: America/Sao_Paulo explícito neste MVP, relógio do servidor ao carregar/atualizar a tela. Datas planejadas não são convertidas pelo browser; recarregar após virada do dia. Pendência é data anterior sem conclusão, sem job. Concluir uma pendência conserva a data original, consultável em Planejamento.</w:t>
+      </w:r>
+    </w:p>
+    <w:p>
+      <w:r>
+        <w:t>Lockfile vazio da raiz removido após confirmar ausência de package/workspace; lockfile correto do app preservado. Nenhuma migration antiga, schema de Activity/Goal, RLS existente ou candidata de progresso alterados. Não foi executado db push.</w:t>
+      </w:r>
+    </w:p>
+    <w:p>
+      <w:r>
+        <w:t>Pendente: aplicar somente a nova migration e validar no navegador real A/B, Hoje/Amanhã/data personalizada, duplicação, conclusão/desfazer, pendência/reagendamento, Activity inativa, refresh, duas abas, sessão expirada e rede interrompida. Tipos locais de daily_plan_items identificados como extensão aguardando regeneração oficial após aplicação. Detalhes/checklist no README.md.</w:t>
+      </w:r>
+    </w:p>
+    <w:p>
+      <w:r>
+        <w:t>Próximo módulo recomendado: Calendário simples reutilizando o planejamento, mas NÃO iniciar antes da validação desta entrega pela usuária. V0.2.5 avançada permanece pausada e preservada; Finanças e metas/progresso não implementados nesta entrega.</w:t>
+      </w:r>
+    </w:p>
+    <w:p>
+      <w:r>
+        <w:t>Validação automatizada da primeira entrega MVP: 118 unitários, 91 SQL/PGlite, lint, TypeScript, build e diff-check passaram. A execução SQL paralela concorrente com build excedeu memória; repetida com sucesso com node --test --test-concurrency=1 tests/db/*.test.mjs, sem alterar arquitetura. Build com acesso à fonte externa; aviso cacheComponents/partialPrefetching preexistente. Aplicação remota e validação no navegador continuam PENDENTES; Calendário não iniciado.</w:t>
       </w:r>
     </w:p>
     <w:sectPr>

</xml_diff>

<commit_message>
aplicação da migration nova no Supabase de desenvolvimento e teste o fluxo real.
</commit_message>
<xml_diff>
--- a/rotina/doc/Backlog_Projeto_Rotina_v0.2.docx
+++ b/rotina/doc/Backlog_Projeto_Rotina_v0.2.docx
@@ -8285,6 +8285,41 @@
     <w:p>
       <w:r>
         <w:t>Validação automatizada da primeira entrega MVP: 118 unitários, 91 SQL/PGlite, lint, TypeScript, build e diff-check passaram. A execução SQL paralela concorrente com build excedeu memória; repetida com sucesso com node --test --test-concurrency=1 tests/db/*.test.mjs, sem alterar arquitetura. Build com acesso à fonte externa; aviso cacheComponents/partialPrefetching preexistente. Aplicação remota e validação no navegador continuam PENDENTES; Calendário não iniciado.</w:t>
+      </w:r>
+    </w:p>
+    <w:p>
+      <w:r>
+        <w:t>MVP — aplicação remota de Planejamento + Hoje — 22/10/2026</w:t>
+      </w:r>
+    </w:p>
+    <w:p>
+      <w:r>
+        <w:t>Prioridade atual: desktop/computador. Manter mobile básico quando simples, sem atrasar funcionalidades; rodada específica de responsividade após todas as telas do MVP funcionarem.</w:t>
+      </w:r>
+    </w:p>
+    <w:p>
+      <w:r>
+        <w:t>Aplicada exclusivamente 20261022000100_daily_plan_items.sql no projeto vinculado Rotina - Desenvolvimento, previamente confirmado ativo. Dry-run mostrou apenas essa migration; push --linked --skip-vault --yes executado sem seeds, roles ou atualização de Vault. Migrations locais/remotas agora alinhadas em sete versões. Nenhum arquivo de candidates, progresso ou schema experimental aplicado.</w:t>
+      </w:r>
+    </w:p>
+    <w:p>
+      <w:r>
+        <w:t>Tipos oficiais public regenerados com Supabase CLI 2.120.0: gen types typescript --linked --schema public. Comparação estrutural das dez tabelas, campos/opcionais/nullability, FKs, RPCs e demais estruturas sem divergência. Adotado somente o bloco gerado de daily_plan_items e comentário de origem; demais contratos e aliases preservados. Sem credenciais versionadas.</w:t>
+      </w:r>
+    </w:p>
+    <w:p>
+      <w:r>
+        <w:t>Verificação remota somente de catálogos, em transação READ ONLY: RLS, três policies de authenticated, grants restritos, ausência de DELETE e leitura anon, FK composta, unicidade, índice e trigger SECURITY INVOKER confirmados. As seis tabelas de progresso da candidata permanecem ausentes do remoto. Isso não valida o fluxo funcional A/B no navegador.</w:t>
+      </w:r>
+    </w:p>
+    <w:p>
+      <w:r>
+        <w:t>Validação pós-tipos: 118 unitários, 18 SQL/PGlite de catálogo/repository/planejamento e TypeScript passaram. A suíte SQL completa de 91 e o build aprovados na implementação anterior permanecem como evidência daquela entrega; não foram repetidos integralmente por esta adoção equivalente de tipos.</w:t>
+      </w:r>
+    </w:p>
+    <w:p>
+      <w:r>
+        <w:t>Pendente: validar no navegador desktop Hoje/Amanhã/data, duplicação, concluir/desfazer, pendências/reagendamento, Activity inativa, persistência, A/B, duas abas, sessão expirada e falha de rede. A aplicação da migration está concluída; não registrar esses fluxos como aprovados sem execução real. Calendário não iniciado. V0.2.5 avançada continua pausada e preservada.</w:t>
       </w:r>
     </w:p>
     <w:sectPr>

</xml_diff>

<commit_message>
implementação dos modulos da aplicação rotina
</commit_message>
<xml_diff>
--- a/rotina/doc/Backlog_Projeto_Rotina_v0.2.docx
+++ b/rotina/doc/Backlog_Projeto_Rotina_v0.2.docx
@@ -2,6 +2,31 @@
 <file path=word/document.xml><?xml version="1.0" encoding="utf-8"?>
 <w:document xmlns:wpc="http://schemas.microsoft.com/office/word/2010/wordprocessingCanvas" xmlns:mo="http://schemas.microsoft.com/office/mac/office/2008/main" xmlns:mc="http://schemas.openxmlformats.org/markup-compatibility/2006" xmlns:mv="urn:schemas-microsoft-com:mac:vml" xmlns:o="urn:schemas-microsoft-com:office:office" xmlns:r="http://schemas.openxmlformats.org/officeDocument/2006/relationships" xmlns:m="http://schemas.openxmlformats.org/officeDocument/2006/math" xmlns:v="urn:schemas-microsoft-com:vml" xmlns:wp14="http://schemas.microsoft.com/office/word/2010/wordprocessingDrawing" xmlns:wp="http://schemas.openxmlformats.org/drawingml/2006/wordprocessingDrawing" xmlns:w10="urn:schemas-microsoft-com:office:word" xmlns:w="http://schemas.openxmlformats.org/wordprocessingml/2006/main" xmlns:w14="http://schemas.microsoft.com/office/word/2010/wordml" xmlns:wpg="http://schemas.microsoft.com/office/word/2010/wordprocessingGroup" xmlns:wpi="http://schemas.microsoft.com/office/word/2010/wordprocessingInk" xmlns:wne="http://schemas.microsoft.com/office/word/2006/wordml" xmlns:wps="http://schemas.microsoft.com/office/word/2010/wordprocessingShape" mc:Ignorable="w14 wp14">
   <w:body>
+    <w:p>
+      <w:r>
+        <w:t xml:space="preserve">27/10/2026 — Preparação para uso oficial: mecanismo temporário de limpeza dos dados de teste preparado, sem execução real. Auditoria remota READ ONLY confirmou 16 tabelas funcionais por owner e ausência da candidata pausada. Prévia em /dev/limpar-dados habilitada somente localmente; DEV_DATA_CLEANUP_ALLOW_EXECUTE=false mantém exclusão bloqueada. Operação futura exige sessão real verificada, prévia de contagens por tabela, confirmação explícita da usuária e frase APAGAR MEUS DADOS DE TESTE. CLI local autenticado, sem service_role, sem user_id arbitrário, transação única com ordem de FKs e quebra do vínculo financeiro; zero final e hashes de outros owners/Auth/estrutura conferidos antes de COMMIT. Nenhuma migration/schema/função/policy alterada. 171 unitários e 118 SQL/PGlite, lint, TypeScript, build e diff-check aprovados; HTTP de produção 404; roteiro em README e doc/MVP-limpeza-dados-teste.md. Login/conta B reais serão conferidos somente após execução autorizada. Não foi executada limpeza real nem iniciada exclusão definitiva de conta; esta será a próxima tarefa. Remover/desativar a ferramenta depois do uso. Este registro substitui o ponto de retomada anterior.</w:t>
+      </w:r>
+    </w:p>
+    <w:p>
+      <w:r>
+        <w:t xml:space="preserve">27/10/2026 — Extensão de Finanças antes do fechamento final: Contas fixas / Contas do mês implementada, aguardando validação desktop real. Cadastro permanente e estados mensais únicos por owner/conta/referência, com histórico, valor mensal independente do padrão, snapshots de nome/categoria/vencimento e desativação sem apagar estados existentes. Virada fixa dia 20 (1–19 mês anterior; 20–31 atual), centralizada e testada. Inicialização lazy e idempotente, sem cron. Pagar cria uma única despesa na data real; editar valor pago atualiza a mesma despesa; desfazer remove exclusivamente a vinculada, atomicamente. Lançamentos manuais preservados; gerados editáveis somente pela conta mensal. RLS/FKs por owner, centavos inteiros e totais BigInt, snapshots exatos/retry seguro; três RPCs pequenas com auth verificada e privilégios restritos. Migration 20261027000300_fixed_expenses.sql aplicada somente no Rotina - Desenvolvimento após dry-run; onze versões alinhadas e tipos oficiais sem divergências. 161 unitários e 112 SQL/PGlite aprovados, incluindo rollback e A/B. Roteiro de navegador e verificações finais no README. MVP base dos sete módulos permanece validado; aguardar validação desta extensão antes do fechamento final de Finanças. Sem responsividade avançada ou outras funcionalidades grandes. Este registro substitui o ponto de retomada anterior.</w:t>
+      </w:r>
+    </w:p>
+    <w:p>
+      <w:r>
+        <w:t xml:space="preserve">27/10/2026 — MVP funcional concluído; etapa atual: acabamento e responsividade. Finanças validado no navegador real pela usuária; Banco Mestre/Áreas, Hoje, Planejamento, Calendário, Ideias, Projetos e Finanças concluídos funcionalmente. Auditoria A/B/C em doc/MVP-auditoria-acabamento.md: corrigidos controles sem ação, template/Em breve, cabeçalhos das subrotas, nova tentativa de leitura, retorno ao login e pequenas quebras de layout; sem mocks nas dependências das páginas ou destinos ausentes nos links internos literais inspecionados. B: responsividade medida, temas, densidade e estados visuais. C: busca/configurações, proteção de rascunhos ao sair e limpeza de componentes sem uso. 153 unitários, 104 SQL/PGlite, lint, TypeScript, build e diff-check aprovados; conferir aparência das correções no navegador. Sem migration, integração, Occurrence ou retomada da arquitetura avançada. Este registro substitui os estados anteriores do MVP.</w:t>
+      </w:r>
+    </w:p>
+    <w:p>
+      <w:r>
+        <w:t xml:space="preserve">27/10/2026 — Último grande módulo do MVP: Projetos validado no navegador real e concluído. Finanças implementado com receitas/despesas, edição, escolha de mês, lista real, totais de receitas/despesas/saldo e despesas por categoria em ordem decrescente. Uma tabela financial_transactions, amount_cents INTEGER positivo, RLS por owner, grants por coluna, timestamps do banco e snapshot exato; sem RPC. Conversão monetária e somas inteiras sem ponto flutuante; limite por lançamento R$ 21.474.836,47. Migration 20261027000200_financial_transactions.sql aplicada somente no Rotina - Desenvolvimento após dry-run; dez versões alinhadas, tipos oficiais sem divergências. 150 unitários, 104 SQL/PGlite, lint, TypeScript, build e diff-check aprovados. Pendente: navegador desktop real para criar receita/despesa, editar, mês vazio/vários lançamentos, troca de mês, centavos, totais/saldos/categorias, refresh, A/B, expiração, conflito e falha de rede sem falso sucesso; rascunho preservado. Banco Mestre/Áreas, Hoje, Planejamento, Calendário, Ideias e Projetos funcionais e validados. Finanças aguarda validação real. Sem integrações bancárias/Open Finance, faturas/cartões, parcelas avançadas, investimentos, metas financeiras, previsão, IA ou importação. Não iniciar refinamentos gerais ou responsividade avançada antes da validação de Finanças. Este registro substitui os estados anteriores desses módulos; roteiro no README.</w:t>
+      </w:r>
+    </w:p>
+    <w:p>
+      <w:r>
+        <w:t xml:space="preserve">27/10/2026 — MVP: Ideias validado no navegador real e concluído. Projetos implementado: criar/listar/abrir/editar, tarefas editáveis, concluir/desfazer e progresso concluídas/total (sem tarefas = 0%). Migration 20261027000100_projects.sql aplicada somente no Rotina - Desenvolvimento após dry-run, nove versões alinhadas; RLS por owner, FK composta, timestamps do banco, sem RPC. Tipos oficiais sem divergências. 141 unitários, 100 SQL/PGlite, lint, TypeScript, build e diff-check aprovados. Pendente: validação desktop real de criação/edição, 0%/parcial/100%, várias tarefas, refresh, A/B, sessão expirada, rede e conflito com rascunho preservado e sem falso sucesso. Sem sessões, cronômetro, subtarefas, dependências, Kanban, comentários, anexos, compartilhamento, IA, versões ou automações. Finanças não iniciado: aguardar validação de Projetos. Este registro substitui os estados anteriores desses módulos. Roteiro completo no README.</w:t>
+      </w:r>
+    </w:p>
     <w:p>
       <w:pPr>
         <w:pStyle w:val="Title"/>
@@ -8320,6 +8345,16 @@
     <w:p>
       <w:r>
         <w:t>Pendente: validar no navegador desktop Hoje/Amanhã/data, duplicação, concluir/desfazer, pendências/reagendamento, Activity inativa, persistência, A/B, duas abas, sessão expirada e falha de rede. A aplicação da migration está concluída; não registrar esses fluxos como aprovados sem execução real. Calendário não iniciado. V0.2.5 avançada continua pausada e preservada.</w:t>
+      </w:r>
+    </w:p>
+    <w:p>
+      <w:r>
+        <w:t>Atualização 26/10/2026: Hoje e Planejamento validados. Calendário MVP implementado sobre daily_plan_items, sem nova tabela ou recorrência: mês, navegação, seleção por URL, contadores, Área/status, detalhe e Planejar nesta data. Aguarda validação desktop: vazio, vários dias/itens, status, hoje, links, refresh, A/B e Activity desativada. Não iniciar Ideias/Projetos/Finanças antes da validação. Próximo recomendado após aprovação: Projetos manual mínimo.</w:t>
+      </w:r>
+    </w:p>
+    <w:p>
+      <w:r>
+        <w:t>Atualização 26/10/2026 — Calendário validado e concluído para o MVP. Ideias implementado: lista real, nova ideia, detalhe/edição e + global reutilizado. Tabela ideas com RLS owner, timestamps do banco e edição condicional por updated_at, sem RPC. Rascunho preservado em falha. Validar desktop: criar, editar, refresh, vazio/várias, texto longo, A/B, expiração e rede. Não iniciar Projetos/Finanças antes da validação de Ideias. Migration 20261026000100 aplicada exclusivamente no desenvolvimento; oito versões alinhadas. Unitários, SQL/PGlite 95/95, lint e TypeScript aprovados. Validação no navegador pendente.</w:t>
       </w:r>
     </w:p>
     <w:sectPr>

</xml_diff>

<commit_message>
exclusão de conta e limpeza de itens de teste
</commit_message>
<xml_diff>
--- a/rotina/doc/Backlog_Projeto_Rotina_v0.2.docx
+++ b/rotina/doc/Backlog_Projeto_Rotina_v0.2.docx
@@ -8355,6 +8355,26 @@
     <w:p>
       <w:r>
         <w:t>Atualização 26/10/2026 — Calendário validado e concluído para o MVP. Ideias implementado: lista real, nova ideia, detalhe/edição e + global reutilizado. Tabela ideas com RLS owner, timestamps do banco e edição condicional por updated_at, sem RPC. Rascunho preservado em falha. Validar desktop: criar, editar, refresh, vazio/várias, texto longo, A/B, expiração e rede. Não iniciar Projetos/Finanças antes da validação de Ideias. Migration 20261026000100 aplicada exclusivamente no desenvolvimento; oito versões alinhadas. Unitários, SQL/PGlite 95/95, lint e TypeScript aprovados. Validação no navegador pendente.</w:t>
+      </w:r>
+    </w:p>
+    <w:p>
+      <w:r>
+        <w:t xml:space="preserve">Atualização 28/10/2026 — MVP funcional concluído. Preparação para uso oficial: exclusão definitiva de conta em /conta, via Minha conta, com confirmação exata EXCLUIR MINHA CONTA. Ferramenta dev de limpeza não reutilizada e execução continua bloqueada.</w:t>
+      </w:r>
+    </w:p>
+    <w:p>
+      <w:r>
+        <w:t xml:space="preserve">Auditoria real: 11 migrations prévias, 16 tabelas funcionais, FKs Auth CASCADE, três vínculos RESTRICT e ciclo financeiro. Supabase Auth não tem privilégios para executar triggers invoker de integridade. Migration 20261028000100_account_deletion aplicada apenas no desenvolvimento, após dry-run exclusivo, sem seeds/roles/Vault. Trigger privado SECURITY DEFINER antes de DELETE em auth.users usa OLD.id, sem parâmetros de alvo/RPC pública, e remove dados na mesma transação do hard delete Auth. Falha reverte dados/Auth/sessões/tokens juntos.</w:t>
+      </w:r>
+    </w:p>
+    <w:p>
+      <w:r>
+        <w:t xml:space="preserve">Servidor Next.js: POST same-origin, entrada estrita, identidade de JWT verificado mais getUser online imediatamente antes de excluir. SUPABASE_SECRET_KEY apenas no servidor do mesmo projeto, módulo server-only, sem NEXT_PUBLIC/logs/persistência. Auth ausente confirmado em retry antes de sucesso; limpeza de sessão e cookies, retorno ao login. JWT emitido permanece criptograficamente válido até expirar; guard online e FKs Auth bloqueiam uso/recriação de dados após exclusão. Storage não aplicável no estado atual: zero buckets/objetos e sem uploads.</w:t>
+      </w:r>
+    </w:p>
+    <w:p>
+      <w:r>
+        <w:t xml:space="preserve">Validação: 188 testes unitários, 123 SQL/PGlite, 1 PostgreSQL específico de exclusão e 25 PostgreSQL existentes; lint, TypeScript, build e inspeção dos bundles públicos aprovados. Cobertura A/B, 16 tabelas populadas, sessões/tokens, rollback integral, retry/perda de resposta, identidade, confirmação e UI. Detalhes e roteiro: README e doc/MVP-exclusao-conta.md. Exclusão real/login/refresh no navegador pendentes de segredo administrativo configurado e conta secundária descartável; nenhuma conta real excluída, nunca usar a conta principal. Candidata de progresso não alterada nem promovida.</w:t>
       </w:r>
     </w:p>
     <w:sectPr>

</xml_diff>

<commit_message>
versão final - 29/10/26
</commit_message>
<xml_diff>
--- a/rotina/doc/Backlog_Projeto_Rotina_v0.2.docx
+++ b/rotina/doc/Backlog_Projeto_Rotina_v0.2.docx
@@ -8375,6 +8375,91 @@
     <w:p>
       <w:r>
         <w:t xml:space="preserve">Validação: 188 testes unitários, 123 SQL/PGlite, 1 PostgreSQL específico de exclusão e 25 PostgreSQL existentes; lint, TypeScript, build e inspeção dos bundles públicos aprovados. Cobertura A/B, 16 tabelas populadas, sessões/tokens, rollback integral, retry/perda de resposta, identidade, confirmação e UI. Detalhes e roteiro: README e doc/MVP-exclusao-conta.md. Exclusão real/login/refresh no navegador pendentes de segredo administrativo configurado e conta secundária descartável; nenhuma conta real excluída, nunca usar a conta principal. Candidata de progresso não alterada nem promovida.</w:t>
+      </w:r>
+    </w:p>
+    <w:p>
+      <w:r>
+        <w:t xml:space="preserve">Atualização 28/10/2026 — Auditoria funcional e UX desktop. MVP funcional concluído, conta de teste limpa, exclusão validada pela usuária e performance anterior preservada. Revisados Hoje, Planejamento, Calendário, Banco Mestre/Áreas, Projetos/tarefas, Ideias, Finanças/contas fixas e Conta/Auth, incluindo criações e edições. Sem mobile/tablet, redesign, migrations, novas dependências ou candidata de progresso.</w:t>
+      </w:r>
+    </w:p>
+    <w:p>
+      <w:r>
+        <w:t xml:space="preserve">Correções: proteção de rascunhos em links visíveis, Cancelar, logout e recarregar/fechar; bloqueio durante gravação; travas imediatas contra envio duplicado em Auth/logout; logout confirmado com navegação completa e mensagem; conta fixa sem save de no-op e com feedback de valor/dia inválidos; títulos semânticos, erro/404 em português, erro local de Contas do mês e largura do formulário de item. Menu/+ ocultos nas telas Auth. Chrome isolado 1440×900 confirmou labels, h1 e remoção de rolagem extra de 160 px. Nenhum novo defeito crítico de persistência/isolamento confirmado.</w:t>
+      </w:r>
+    </w:p>
+    <w:p>
+      <w:r>
+        <w:t xml:space="preserve">Backlog explícito: Voltar/Avançar nativos em navegação SPA ainda não têm proteção universal; não manipular history/popstate do Next nesta rodada. Salvar antes de usar histórico do navegador. Persistência de rascunhos exige desenho por conta/privacidade. Validar desktop autenticado com duas abas, rede lenta/offline, tabelas longas e tema escuro antes da etapa mobile. Fixtures visuais são read-only e sintéticos; não equivalem a validação backend autenticada. Ferramenta /dev/limpar-dados mantida isolada em development, sem habilitar/aplicar limpeza; nenhuma exclusão real executada.</w:t>
+      </w:r>
+    </w:p>
+    <w:p>
+      <w:r>
+        <w:t xml:space="preserve">Validação aprovada: 200 unitários, 123 SQL/PGlite, 1 regressão PostgreSQL local de conta, lint, TypeScript, build e diff-check. Lista de arquivos: README e doc/MVP-auditoria-funcional-desktop.md. Unitários incluem proteção de navegação, cancelamento, pending/duplo clique, Auth, logout e estado salvo da conta fixa; SQL/PGlite e PostgreSQL local cobrem fluxos, A/B e rollback. Lint, TypeScript, build e diff-check no fechamento. Não iniciar responsividade mobile/tablet antes da validação desktop.</w:t>
+      </w:r>
+    </w:p>
+    <w:p>
+      <w:r>
+        <w:t xml:space="preserve">Atualização 29/10/2026 — Responsividade mobile e tablet. Desktop preservado a partir de 1280 px; navegação inferior compartilhada abaixo disso, menu Mais com tema/Conta e mesmo botão +. Ajustados calendário, alvos de toque, formulários Auth, tarefas e Finanças com cards estreitos e tabela desktop. Sem regras novas, migrations, dependências ou candidata de progresso.</w:t>
+      </w:r>
+    </w:p>
+    <w:p>
+      <w:r>
+        <w:t xml:space="preserve">Validação: Chrome isolado em 320×800, 360×800, 390×844, 768×1024, 1024×768, 1280×800 e 1440×900; 126 vistas de componentes reais com dados sintéticos e Auth público, sem overflow horizontal global ou erros JavaScript capturados. Fixtures temporários removidos do app; nenhuma escrita em dados reais. 203 unitários, 123 SQL/PGlite e 1 regressão PostgreSQL local aprovados; lint e TypeScript aprovados. Resultado de build/diff-check e screenshots em doc/MVP-responsividade.md.</w:t>
+      </w:r>
+    </w:p>
+    <w:p>
+      <w:r>
+        <w:t xml:space="preserve">Backlog/validação manual: conferir percurso autenticado em celular/tablet físico, teclado virtual, safe areas, rotação e seletores nativos; capturas emuladas não substituem aparelho real. Preservadas limitações de rascunho/Voltar do desktop. Polimento de listas extensas e acessibilidade formal ficam para evolução. Nenhuma nova funcionalidade iniciada.</w:t>
+      </w:r>
+    </w:p>
+    <w:p>
+      <w:r>
+        <w:t>MVP — preparação de deploy/produção — 29/10/2026</w:t>
+      </w:r>
+    </w:p>
+    <w:p>
+      <w:r>
+        <w:t>Contexto confirmado pela usuária: MVP funcional, performance, UX desktop, responsividade e exclusão de conta concluídos. Próximo marco é publicar com Vercel + projeto Supabase Production separado. Development permanece preservado; V0.2.5 avançada continua pausada.</w:t>
+      </w:r>
+    </w:p>
+    <w:p>
+      <w:r>
+        <w:t>Fonte operacional: doc/MVP-deploy-producao.md. Lista as 12 migrations versionadas, 16 tabelas com RLS, trigger de exclusão, Auth/SMTP, variáveis, Git, smoke e rollback. Nenhum candidate ou dado de teste será migrado. Nenhum projeto Production, deploy, conta, merge ou push executado nesta preparação.</w:t>
+      </w:r>
+    </w:p>
+    <w:p>
+      <w:r>
+        <w:t>Ajustes locais: Node 24.x fixado em package/metadata do lock sem alterar dependências; .env.example com placeholders por ambiente; metadata por origem pública/hosts Vercel, rejeitando origem local ou ausente na Vercel Production. Redirects Auth já dinâmicos por window.location.origin e callback interno foram preservados; NEXT_PUBLIC_SITE_URL é opcional apenas para metadata.</w:t>
+      </w:r>
+    </w:p>
+    <w:p>
+      <w:r>
+        <w:t>Segurança Git: nove caches CLI versionados na raiz foram retirados do índice, sem apagar os arquivos locais, e ignorados globalmente. Detectada URL de conexão sem senha nesses arquivos atuais; nenhum JWT, chave administrativa ou senha embutida. Não houve reescrita de histórico. Revisar/commitar as remoções antes da promoção.</w:t>
+      </w:r>
+    </w:p>
+    <w:p>
+      <w:r>
+        <w:t>Verificações: npm ci, 206 unitários, 123 SQL/PGlite seriais, lint, TypeScript e build aprovados. Preflight local de produção passou 17 checks HTTP; login 200, oito rotas protegidas 307, dev página/APIs 404 mesmo com flags true, exclusão sem sessão 401 e cross-origin 403. Marcador administrativo fictício e chaves administrativas ausentes dos 33 assets de navegador inspecionados. Sem cookies/JWT, uso de segredo real ou operações autenticadas nesse smoke.</w:t>
+      </w:r>
+    </w:p>
+    <w:p>
+      <w:r>
+        <w:t>Pendências de manutenção não bloqueantes no uso atual: npm audit runtime zero; um moderado no parser CSS transitivo de build/Tailwind, sem entrada CSS não confiável processada por requests. Advisory e patch disponível documentados. Aviso de suporte do ESLint 9 registrado; sem audit fix amplo.</w:t>
+      </w:r>
+    </w:p>
+    <w:p>
+      <w:r>
+        <w:t>Git após fetch: origin/main=14ec561 e desenvolvimento=dc6d110, 4/9 commits exclusivos. Simulação de merge sem conflito dos commits, sem incluir alterações locais pendentes. Revisar/commitar o trabalho, PR desenvolvimento -&gt; main preservando históricos e SHA final aprovado. Não fazer force-push, rebase/reset destrutivo ou deploy da main antiga.</w:t>
+      </w:r>
+    </w:p>
+    <w:p>
+      <w:r>
+        <w:t>Vercel: Root Directory rotina, framework Next.js, Node 24.x, npm ci/npm run build e output padrão. Production Branch main. Variáveis Production: NEXT_PUBLIC_SUPABASE_URL, NEXT_PUBLIC_SUPABASE_PUBLISHABLE_KEY e SUPABASE_SECRET_KEY como Secret somente servidor; NEXT_PUBLIC_SITE_URL opcional. Sem DEV_*, credenciais Development, senha de banco ou token CLI no Vercel.</w:t>
+      </w:r>
+    </w:p>
+    <w:p>
+      <w:r>
+        <w:t>Próxima ação manual: criar Supabase Production e configurar SMTP; após confirmar projeto/dry-run em worktree/link separado, aplicar só as 12 migrations e conferir schema/tipos/RLS/triggers/exclusão. Configurar Vercel e Auth com alias HTTPS estável e callbacks exatos, sem localhost em Production. Smoke com conta secundária; exclusão apenas após confirmação manual da usuária. Conta oficial somente depois de todos os itens aprovados. Rollback não deve redirecionar Production a Development nem apagar banco/projetos.</w:t>
       </w:r>
     </w:p>
     <w:sectPr>

</xml_diff>

<commit_message>
Melhoria: adicionar subtarefas nos projetos e um medidor de evolução da tarefas
</commit_message>
<xml_diff>
--- a/rotina/doc/Backlog_Projeto_Rotina_v0.2.docx
+++ b/rotina/doc/Backlog_Projeto_Rotina_v0.2.docx
@@ -2,6 +2,11 @@
 <file path=word/document.xml><?xml version="1.0" encoding="utf-8"?>
 <w:document xmlns:wpc="http://schemas.microsoft.com/office/word/2010/wordprocessingCanvas" xmlns:mo="http://schemas.microsoft.com/office/mac/office/2008/main" xmlns:mc="http://schemas.openxmlformats.org/markup-compatibility/2006" xmlns:mv="urn:schemas-microsoft-com:mac:vml" xmlns:o="urn:schemas-microsoft-com:office:office" xmlns:r="http://schemas.openxmlformats.org/officeDocument/2006/relationships" xmlns:m="http://schemas.openxmlformats.org/officeDocument/2006/math" xmlns:v="urn:schemas-microsoft-com:vml" xmlns:wp14="http://schemas.microsoft.com/office/word/2010/wordprocessingDrawing" xmlns:wp="http://schemas.openxmlformats.org/drawingml/2006/wordprocessingDrawing" xmlns:w10="urn:schemas-microsoft-com:office:word" xmlns:w="http://schemas.openxmlformats.org/wordprocessingml/2006/main" xmlns:w14="http://schemas.microsoft.com/office/word/2010/wordml" xmlns:wpg="http://schemas.microsoft.com/office/word/2010/wordprocessingGroup" xmlns:wpi="http://schemas.microsoft.com/office/word/2010/wordprocessingInk" xmlns:wne="http://schemas.microsoft.com/office/word/2006/wordml" xmlns:wps="http://schemas.microsoft.com/office/word/2010/wordprocessingShape" mc:Ignorable="w14 wp14">
   <w:body>
+    <w:p>
+      <w:r>
+        <w:t xml:space="preserve">31/10/2026 — V0.3 Projetos avançados implementada localmente: modos tasks/manual/hybrid, estágios parciais, subtarefas multinível, pesos e cálculo recursivo. Migration 20261031000100_projects_advanced.sql NÃO aplicada em Production. Pendências: smoke autenticado desktop/mobile; teclado nos sliders e expandir/recolher; dois usuários e duas abas; revisão da migration antes de futura promoção autorizada. Sem exclusão/movimentação de tarefas. Testes e decisões em doc/V0.3-projetos-avancados.md. Sem deploy e sem retomada da V0.2.5.</w:t>
+      </w:r>
+    </w:p>
     <w:p>
       <w:r>
         <w:t xml:space="preserve">27/10/2026 — Preparação para uso oficial: mecanismo temporário de limpeza dos dados de teste preparado, sem execução real. Auditoria remota READ ONLY confirmou 16 tabelas funcionais por owner e ausência da candidata pausada. Prévia em /dev/limpar-dados habilitada somente localmente; DEV_DATA_CLEANUP_ALLOW_EXECUTE=false mantém exclusão bloqueada. Operação futura exige sessão real verificada, prévia de contagens por tabela, confirmação explícita da usuária e frase APAGAR MEUS DADOS DE TESTE. CLI local autenticado, sem service_role, sem user_id arbitrário, transação única com ordem de FKs e quebra do vínculo financeiro; zero final e hashes de outros owners/Auth/estrutura conferidos antes de COMMIT. Nenhuma migration/schema/função/policy alterada. 171 unitários e 118 SQL/PGlite, lint, TypeScript, build e diff-check aprovados; HTTP de produção 404; roteiro em README e doc/MVP-limpeza-dados-teste.md. Login/conta B reais serão conferidos somente após execução autorizada. Não foi executada limpeza real nem iniciada exclusão definitiva de conta; esta será a próxima tarefa. Remover/desativar a ferramenta depois do uso. Este registro substitui o ponto de retomada anterior.</w:t>

</xml_diff>